<commit_message>
Dodanie pkt 2 do sprawozdania
</commit_message>
<xml_diff>
--- a/Sprawozdanie_wersja_robocza/IO_Projekt.docx
+++ b/Sprawozdanie_wersja_robocza/IO_Projekt.docx
@@ -105,13 +105,7 @@
           <w:rPr>
             <w:rStyle w:val="Hipercze"/>
           </w:rPr>
-          <w:t>LIN</w:t>
-        </w:r>
-        <w:r>
-          <w:rPr>
-            <w:rStyle w:val="Hipercze"/>
-          </w:rPr>
-          <w:t>K</w:t>
+          <w:t>LINK</w:t>
         </w:r>
       </w:hyperlink>
     </w:p>
@@ -177,6 +171,763 @@
         <w:t>mechanik może wykluczyć go z wyścigu. - Za analizę danych odpowiada Statystyk, który przygotowuje raporty finansowe z podziałem na źródła przychodu: wpisowe, zakłady, sklep oraz subskrypcje</w:t>
       </w:r>
     </w:p>
+    <w:p>
+      <w:pPr>
+        <w:pStyle w:val="Nagwek1"/>
+        <w:numPr>
+          <w:ilvl w:val="0"/>
+          <w:numId w:val="2"/>
+        </w:numPr>
+      </w:pPr>
+      <w:r>
+        <w:t>Cel budowania</w:t>
+      </w:r>
+    </w:p>
+    <w:p>
+      <w:pPr>
+        <w:rPr>
+          <w:b/>
+          <w:bCs/>
+        </w:rPr>
+      </w:pPr>
+      <w:r>
+        <w:rPr>
+          <w:b/>
+          <w:bCs/>
+        </w:rPr>
+        <w:t>Cel budowania:</w:t>
+      </w:r>
+    </w:p>
+    <w:p>
+      <w:pPr>
+        <w:rPr>
+          <w:lang w:eastAsia="pl-PL"/>
+        </w:rPr>
+      </w:pPr>
+      <w:r>
+        <w:rPr>
+          <w:lang w:eastAsia="pl-PL"/>
+        </w:rPr>
+        <w:t>System ma obsługiwać zamkniętą platformę internetową przeznaczoną dla kierowców, mechaników, administratorów oraz statystyków związanych z organizacją wyścigów samochodowych. Platforma ma działać na zasadzie zaproszeń i umożliwiać zarządzanie kierowcami, samochodami, wyścigami, sklepem z modyfikacjami, abonamentami oraz raportami finansowymi.</w:t>
+      </w:r>
+    </w:p>
+    <w:p>
+      <w:pPr>
+        <w:rPr>
+          <w:lang w:eastAsia="pl-PL"/>
+        </w:rPr>
+      </w:pPr>
+      <w:r>
+        <w:rPr>
+          <w:lang w:eastAsia="pl-PL"/>
+        </w:rPr>
+        <w:t>System ma umożliwiać kierowcom rejestrację za pomocą kodu zaproszenia, dodawanie samochodów do wirtualnego garażu, przeglądanie terminarza wyścigów, wyzywanie innych kierowców na pojedynek oraz korzystanie ze sklepu z częściami. Administrator ma mieć możliwość zarządzania trasami, użytkownikami, materiałami wideo i blokadami kierowców. Mechanik ma sprawdzać stan samochodów przed wyścigiem, a statystyk przygotowywać raporty finansowe.</w:t>
+      </w:r>
+    </w:p>
+    <w:p>
+      <w:pPr>
+        <w:rPr>
+          <w:lang w:eastAsia="pl-PL"/>
+        </w:rPr>
+      </w:pPr>
+      <w:r>
+        <w:rPr>
+          <w:b/>
+          <w:bCs/>
+          <w:lang w:eastAsia="pl-PL"/>
+        </w:rPr>
+        <w:t>Zakres systemu:</w:t>
+      </w:r>
+    </w:p>
+    <w:p>
+      <w:pPr>
+        <w:numPr>
+          <w:ilvl w:val="0"/>
+          <w:numId w:val="3"/>
+        </w:numPr>
+        <w:rPr>
+          <w:lang w:eastAsia="pl-PL"/>
+        </w:rPr>
+      </w:pPr>
+      <w:r>
+        <w:rPr>
+          <w:lang w:eastAsia="pl-PL"/>
+        </w:rPr>
+        <w:t xml:space="preserve">rejestracja kierowców na podstawie kodu zaproszenia, </w:t>
+      </w:r>
+    </w:p>
+    <w:p>
+      <w:pPr>
+        <w:numPr>
+          <w:ilvl w:val="0"/>
+          <w:numId w:val="3"/>
+        </w:numPr>
+        <w:rPr>
+          <w:lang w:eastAsia="pl-PL"/>
+        </w:rPr>
+      </w:pPr>
+      <w:r>
+        <w:rPr>
+          <w:lang w:eastAsia="pl-PL"/>
+        </w:rPr>
+        <w:t xml:space="preserve">logowanie użytkowników do systemu, </w:t>
+      </w:r>
+    </w:p>
+    <w:p>
+      <w:pPr>
+        <w:numPr>
+          <w:ilvl w:val="0"/>
+          <w:numId w:val="3"/>
+        </w:numPr>
+        <w:rPr>
+          <w:lang w:eastAsia="pl-PL"/>
+        </w:rPr>
+      </w:pPr>
+      <w:r>
+        <w:rPr>
+          <w:lang w:eastAsia="pl-PL"/>
+        </w:rPr>
+        <w:t xml:space="preserve">dodawanie samochodów do wirtualnego garażu, </w:t>
+      </w:r>
+    </w:p>
+    <w:p>
+      <w:pPr>
+        <w:numPr>
+          <w:ilvl w:val="0"/>
+          <w:numId w:val="3"/>
+        </w:numPr>
+        <w:rPr>
+          <w:lang w:eastAsia="pl-PL"/>
+        </w:rPr>
+      </w:pPr>
+      <w:r>
+        <w:rPr>
+          <w:lang w:eastAsia="pl-PL"/>
+        </w:rPr>
+        <w:t xml:space="preserve">zapisywanie parametrów samochodu, takich jak marka, model, moc silnika i maksymalna prędkość, </w:t>
+      </w:r>
+    </w:p>
+    <w:p>
+      <w:pPr>
+        <w:numPr>
+          <w:ilvl w:val="0"/>
+          <w:numId w:val="3"/>
+        </w:numPr>
+        <w:rPr>
+          <w:lang w:eastAsia="pl-PL"/>
+        </w:rPr>
+      </w:pPr>
+      <w:r>
+        <w:rPr>
+          <w:lang w:eastAsia="pl-PL"/>
+        </w:rPr>
+        <w:t xml:space="preserve">przeglądanie terminarza nadchodzących wyścigów, </w:t>
+      </w:r>
+    </w:p>
+    <w:p>
+      <w:pPr>
+        <w:numPr>
+          <w:ilvl w:val="0"/>
+          <w:numId w:val="3"/>
+        </w:numPr>
+        <w:rPr>
+          <w:lang w:eastAsia="pl-PL"/>
+        </w:rPr>
+      </w:pPr>
+      <w:r>
+        <w:rPr>
+          <w:lang w:eastAsia="pl-PL"/>
+        </w:rPr>
+        <w:t xml:space="preserve">sprawdzanie lokalizacji miejsca zbiórki, </w:t>
+      </w:r>
+    </w:p>
+    <w:p>
+      <w:pPr>
+        <w:numPr>
+          <w:ilvl w:val="0"/>
+          <w:numId w:val="3"/>
+        </w:numPr>
+        <w:rPr>
+          <w:lang w:eastAsia="pl-PL"/>
+        </w:rPr>
+      </w:pPr>
+      <w:r>
+        <w:rPr>
+          <w:lang w:eastAsia="pl-PL"/>
+        </w:rPr>
+        <w:t xml:space="preserve">wyzywanie innych kierowców na pojedynek, </w:t>
+      </w:r>
+    </w:p>
+    <w:p>
+      <w:pPr>
+        <w:numPr>
+          <w:ilvl w:val="0"/>
+          <w:numId w:val="3"/>
+        </w:numPr>
+        <w:rPr>
+          <w:lang w:eastAsia="pl-PL"/>
+        </w:rPr>
+      </w:pPr>
+      <w:r>
+        <w:rPr>
+          <w:lang w:eastAsia="pl-PL"/>
+        </w:rPr>
+        <w:t xml:space="preserve">wycofanie się z wyścigu maksymalnie 2 godziny przed startem, </w:t>
+      </w:r>
+    </w:p>
+    <w:p>
+      <w:pPr>
+        <w:numPr>
+          <w:ilvl w:val="0"/>
+          <w:numId w:val="3"/>
+        </w:numPr>
+        <w:rPr>
+          <w:lang w:eastAsia="pl-PL"/>
+        </w:rPr>
+      </w:pPr>
+      <w:r>
+        <w:rPr>
+          <w:lang w:eastAsia="pl-PL"/>
+        </w:rPr>
+        <w:t xml:space="preserve">zakup modyfikacji do samochodu w sklepie, </w:t>
+      </w:r>
+    </w:p>
+    <w:p>
+      <w:pPr>
+        <w:numPr>
+          <w:ilvl w:val="0"/>
+          <w:numId w:val="3"/>
+        </w:numPr>
+        <w:rPr>
+          <w:lang w:eastAsia="pl-PL"/>
+        </w:rPr>
+      </w:pPr>
+      <w:r>
+        <w:rPr>
+          <w:lang w:eastAsia="pl-PL"/>
+        </w:rPr>
+        <w:t xml:space="preserve">personalizacja części, np. przez wybór koloru lub dodanie </w:t>
+      </w:r>
+      <w:proofErr w:type="spellStart"/>
+      <w:r>
+        <w:rPr>
+          <w:lang w:eastAsia="pl-PL"/>
+        </w:rPr>
+        <w:t>graweru</w:t>
+      </w:r>
+      <w:proofErr w:type="spellEnd"/>
+      <w:r>
+        <w:rPr>
+          <w:lang w:eastAsia="pl-PL"/>
+        </w:rPr>
+        <w:t xml:space="preserve">, </w:t>
+      </w:r>
+    </w:p>
+    <w:p>
+      <w:pPr>
+        <w:numPr>
+          <w:ilvl w:val="0"/>
+          <w:numId w:val="3"/>
+        </w:numPr>
+        <w:rPr>
+          <w:lang w:eastAsia="pl-PL"/>
+        </w:rPr>
+      </w:pPr>
+      <w:r>
+        <w:rPr>
+          <w:lang w:eastAsia="pl-PL"/>
+        </w:rPr>
+        <w:t xml:space="preserve">obsługa zwrotów i reklamacji części, </w:t>
+      </w:r>
+    </w:p>
+    <w:p>
+      <w:pPr>
+        <w:numPr>
+          <w:ilvl w:val="0"/>
+          <w:numId w:val="3"/>
+        </w:numPr>
+        <w:rPr>
+          <w:lang w:eastAsia="pl-PL"/>
+        </w:rPr>
+      </w:pPr>
+      <w:r>
+        <w:rPr>
+          <w:lang w:eastAsia="pl-PL"/>
+        </w:rPr>
+        <w:t xml:space="preserve">wykupienie oraz anulowanie miesięcznego abonamentu, </w:t>
+      </w:r>
+    </w:p>
+    <w:p>
+      <w:pPr>
+        <w:numPr>
+          <w:ilvl w:val="0"/>
+          <w:numId w:val="3"/>
+        </w:numPr>
+        <w:rPr>
+          <w:lang w:eastAsia="pl-PL"/>
+        </w:rPr>
+      </w:pPr>
+      <w:r>
+        <w:rPr>
+          <w:lang w:eastAsia="pl-PL"/>
+        </w:rPr>
+        <w:t xml:space="preserve">udostępnianie materiałów wideo dla subskrybentów, </w:t>
+      </w:r>
+    </w:p>
+    <w:p>
+      <w:pPr>
+        <w:numPr>
+          <w:ilvl w:val="0"/>
+          <w:numId w:val="3"/>
+        </w:numPr>
+        <w:rPr>
+          <w:lang w:eastAsia="pl-PL"/>
+        </w:rPr>
+      </w:pPr>
+      <w:r>
+        <w:rPr>
+          <w:lang w:eastAsia="pl-PL"/>
+        </w:rPr>
+        <w:t xml:space="preserve">dodawanie tras wyścigowych przez administratora, </w:t>
+      </w:r>
+    </w:p>
+    <w:p>
+      <w:pPr>
+        <w:numPr>
+          <w:ilvl w:val="0"/>
+          <w:numId w:val="3"/>
+        </w:numPr>
+        <w:rPr>
+          <w:lang w:eastAsia="pl-PL"/>
+        </w:rPr>
+      </w:pPr>
+      <w:r>
+        <w:rPr>
+          <w:lang w:eastAsia="pl-PL"/>
+        </w:rPr>
+        <w:t xml:space="preserve">zarządzanie listą zablokowanych kierowców, </w:t>
+      </w:r>
+    </w:p>
+    <w:p>
+      <w:pPr>
+        <w:numPr>
+          <w:ilvl w:val="0"/>
+          <w:numId w:val="3"/>
+        </w:numPr>
+        <w:rPr>
+          <w:lang w:eastAsia="pl-PL"/>
+        </w:rPr>
+      </w:pPr>
+      <w:r>
+        <w:rPr>
+          <w:lang w:eastAsia="pl-PL"/>
+        </w:rPr>
+        <w:t xml:space="preserve">kontrola samochodów przez mechanika przed startem, </w:t>
+      </w:r>
+    </w:p>
+    <w:p>
+      <w:pPr>
+        <w:numPr>
+          <w:ilvl w:val="0"/>
+          <w:numId w:val="3"/>
+        </w:numPr>
+        <w:rPr>
+          <w:lang w:eastAsia="pl-PL"/>
+        </w:rPr>
+      </w:pPr>
+      <w:r>
+        <w:rPr>
+          <w:lang w:eastAsia="pl-PL"/>
+        </w:rPr>
+        <w:t>przygotowywanie raportów finansowych przez statystyka.</w:t>
+      </w:r>
+    </w:p>
+    <w:p>
+      <w:pPr>
+        <w:ind w:left="720"/>
+        <w:rPr>
+          <w:b/>
+          <w:bCs/>
+          <w:lang w:eastAsia="pl-PL"/>
+        </w:rPr>
+      </w:pPr>
+    </w:p>
+    <w:p>
+      <w:pPr>
+        <w:rPr>
+          <w:lang w:eastAsia="pl-PL"/>
+        </w:rPr>
+      </w:pPr>
+      <w:r>
+        <w:rPr>
+          <w:b/>
+          <w:bCs/>
+          <w:lang w:eastAsia="pl-PL"/>
+        </w:rPr>
+        <w:lastRenderedPageBreak/>
+        <w:t>Kontekst systemu:</w:t>
+      </w:r>
+      <w:r>
+        <w:rPr>
+          <w:lang w:eastAsia="pl-PL"/>
+        </w:rPr>
+        <w:br/>
+        <w:t>System funkcjonuje jako aplikacja internetowa dostępna tylko dla uprawnionych użytkowników. Dostęp do platformy otrzymują osoby posiadające kod zaproszenia. Głównymi użytkownikami systemu są kierowcy, mechanicy, administratorzy oraz statystycy. System gromadzi dane o kierowcach, samochodach, wyścigach, częściach, zamówieniach, subskrypcjach oraz raportach finansowych.</w:t>
+      </w:r>
+    </w:p>
+    <w:p>
+      <w:pPr>
+        <w:ind w:left="720"/>
+        <w:rPr>
+          <w:lang w:eastAsia="pl-PL"/>
+        </w:rPr>
+      </w:pPr>
+    </w:p>
+    <w:p>
+      <w:pPr>
+        <w:ind w:left="720"/>
+        <w:rPr>
+          <w:lang w:eastAsia="pl-PL"/>
+        </w:rPr>
+      </w:pPr>
+      <w:r>
+        <w:rPr>
+          <w:b/>
+          <w:bCs/>
+          <w:lang w:eastAsia="pl-PL"/>
+        </w:rPr>
+        <w:t>Korzyści mierzalne:</w:t>
+      </w:r>
+    </w:p>
+    <w:p>
+      <w:pPr>
+        <w:numPr>
+          <w:ilvl w:val="0"/>
+          <w:numId w:val="4"/>
+        </w:numPr>
+        <w:rPr>
+          <w:lang w:eastAsia="pl-PL"/>
+        </w:rPr>
+      </w:pPr>
+      <w:r>
+        <w:rPr>
+          <w:lang w:eastAsia="pl-PL"/>
+        </w:rPr>
+        <w:t xml:space="preserve">dochód z wpisowego za udział w wyścigach, </w:t>
+      </w:r>
+    </w:p>
+    <w:p>
+      <w:pPr>
+        <w:numPr>
+          <w:ilvl w:val="0"/>
+          <w:numId w:val="4"/>
+        </w:numPr>
+        <w:rPr>
+          <w:lang w:eastAsia="pl-PL"/>
+        </w:rPr>
+      </w:pPr>
+      <w:r>
+        <w:rPr>
+          <w:lang w:eastAsia="pl-PL"/>
+        </w:rPr>
+        <w:t xml:space="preserve">dochód z prowizji od zakładów, </w:t>
+      </w:r>
+    </w:p>
+    <w:p>
+      <w:pPr>
+        <w:numPr>
+          <w:ilvl w:val="0"/>
+          <w:numId w:val="4"/>
+        </w:numPr>
+        <w:rPr>
+          <w:lang w:eastAsia="pl-PL"/>
+        </w:rPr>
+      </w:pPr>
+      <w:r>
+        <w:rPr>
+          <w:lang w:eastAsia="pl-PL"/>
+        </w:rPr>
+        <w:t xml:space="preserve">dochód ze sprzedaży części i modyfikacji w sklepie, </w:t>
+      </w:r>
+    </w:p>
+    <w:p>
+      <w:pPr>
+        <w:numPr>
+          <w:ilvl w:val="0"/>
+          <w:numId w:val="4"/>
+        </w:numPr>
+        <w:rPr>
+          <w:lang w:eastAsia="pl-PL"/>
+        </w:rPr>
+      </w:pPr>
+      <w:r>
+        <w:rPr>
+          <w:lang w:eastAsia="pl-PL"/>
+        </w:rPr>
+        <w:t xml:space="preserve">dochód z personalizacji części, np. grawerów i unikalnych kolorów, </w:t>
+      </w:r>
+    </w:p>
+    <w:p>
+      <w:pPr>
+        <w:numPr>
+          <w:ilvl w:val="0"/>
+          <w:numId w:val="4"/>
+        </w:numPr>
+        <w:rPr>
+          <w:lang w:eastAsia="pl-PL"/>
+        </w:rPr>
+      </w:pPr>
+      <w:r>
+        <w:rPr>
+          <w:lang w:eastAsia="pl-PL"/>
+        </w:rPr>
+        <w:t xml:space="preserve">dochód z miesięcznego abonamentu dającego dostęp do materiałów wideo, </w:t>
+      </w:r>
+    </w:p>
+    <w:p>
+      <w:pPr>
+        <w:numPr>
+          <w:ilvl w:val="0"/>
+          <w:numId w:val="4"/>
+        </w:numPr>
+        <w:rPr>
+          <w:lang w:eastAsia="pl-PL"/>
+        </w:rPr>
+      </w:pPr>
+      <w:r>
+        <w:rPr>
+          <w:lang w:eastAsia="pl-PL"/>
+        </w:rPr>
+        <w:t xml:space="preserve">skrócenie czasu potrzebnego na ręczne prowadzenie list uczestników, terminarzy i raportów, </w:t>
+      </w:r>
+    </w:p>
+    <w:p>
+      <w:pPr>
+        <w:numPr>
+          <w:ilvl w:val="0"/>
+          <w:numId w:val="4"/>
+        </w:numPr>
+        <w:rPr>
+          <w:lang w:eastAsia="pl-PL"/>
+        </w:rPr>
+      </w:pPr>
+      <w:r>
+        <w:rPr>
+          <w:lang w:eastAsia="pl-PL"/>
+        </w:rPr>
+        <w:t>zmniejszenie liczby błędów związanych z ręcznym zarządzaniem wyścigami, zamówieniami i subskrypcjami.</w:t>
+      </w:r>
+    </w:p>
+    <w:p>
+      <w:pPr>
+        <w:ind w:left="720"/>
+        <w:rPr>
+          <w:lang w:eastAsia="pl-PL"/>
+        </w:rPr>
+      </w:pPr>
+    </w:p>
+    <w:p>
+      <w:pPr>
+        <w:ind w:left="720"/>
+        <w:rPr>
+          <w:lang w:eastAsia="pl-PL"/>
+        </w:rPr>
+      </w:pPr>
+      <w:r>
+        <w:rPr>
+          <w:b/>
+          <w:bCs/>
+          <w:lang w:eastAsia="pl-PL"/>
+        </w:rPr>
+        <w:t>Korzyści niemierzalne:</w:t>
+      </w:r>
+    </w:p>
+    <w:p>
+      <w:pPr>
+        <w:numPr>
+          <w:ilvl w:val="0"/>
+          <w:numId w:val="5"/>
+        </w:numPr>
+        <w:rPr>
+          <w:lang w:eastAsia="pl-PL"/>
+        </w:rPr>
+      </w:pPr>
+      <w:r>
+        <w:rPr>
+          <w:lang w:eastAsia="pl-PL"/>
+        </w:rPr>
+        <w:t xml:space="preserve">uporządkowanie informacji o kierowcach, samochodach i wyścigach, </w:t>
+      </w:r>
+    </w:p>
+    <w:p>
+      <w:pPr>
+        <w:numPr>
+          <w:ilvl w:val="0"/>
+          <w:numId w:val="5"/>
+        </w:numPr>
+        <w:rPr>
+          <w:lang w:eastAsia="pl-PL"/>
+        </w:rPr>
+      </w:pPr>
+      <w:r>
+        <w:rPr>
+          <w:lang w:eastAsia="pl-PL"/>
+        </w:rPr>
+        <w:t xml:space="preserve">łatwy dostęp do aktualnego terminarza wydarzeń, </w:t>
+      </w:r>
+    </w:p>
+    <w:p>
+      <w:pPr>
+        <w:numPr>
+          <w:ilvl w:val="0"/>
+          <w:numId w:val="5"/>
+        </w:numPr>
+        <w:rPr>
+          <w:lang w:eastAsia="pl-PL"/>
+        </w:rPr>
+      </w:pPr>
+      <w:r>
+        <w:rPr>
+          <w:lang w:eastAsia="pl-PL"/>
+        </w:rPr>
+        <w:t xml:space="preserve">możliwość sprawdzania historii udziału kierowców w wyścigach, </w:t>
+      </w:r>
+    </w:p>
+    <w:p>
+      <w:pPr>
+        <w:numPr>
+          <w:ilvl w:val="0"/>
+          <w:numId w:val="5"/>
+        </w:numPr>
+        <w:rPr>
+          <w:lang w:eastAsia="pl-PL"/>
+        </w:rPr>
+      </w:pPr>
+      <w:r>
+        <w:rPr>
+          <w:lang w:eastAsia="pl-PL"/>
+        </w:rPr>
+        <w:t xml:space="preserve">łatwiejsze zarządzanie reputacją kierowców, </w:t>
+      </w:r>
+    </w:p>
+    <w:p>
+      <w:pPr>
+        <w:numPr>
+          <w:ilvl w:val="0"/>
+          <w:numId w:val="5"/>
+        </w:numPr>
+        <w:rPr>
+          <w:lang w:eastAsia="pl-PL"/>
+        </w:rPr>
+      </w:pPr>
+      <w:r>
+        <w:rPr>
+          <w:lang w:eastAsia="pl-PL"/>
+        </w:rPr>
+        <w:t xml:space="preserve">usprawnienie komunikacji między kierowcami, mechanikami i administratorem, </w:t>
+      </w:r>
+    </w:p>
+    <w:p>
+      <w:pPr>
+        <w:numPr>
+          <w:ilvl w:val="0"/>
+          <w:numId w:val="5"/>
+        </w:numPr>
+        <w:rPr>
+          <w:lang w:eastAsia="pl-PL"/>
+        </w:rPr>
+      </w:pPr>
+      <w:r>
+        <w:rPr>
+          <w:lang w:eastAsia="pl-PL"/>
+        </w:rPr>
+        <w:t xml:space="preserve">większa kontrola nad dopuszczaniem samochodów do wyścigów, </w:t>
+      </w:r>
+    </w:p>
+    <w:p>
+      <w:pPr>
+        <w:numPr>
+          <w:ilvl w:val="0"/>
+          <w:numId w:val="5"/>
+        </w:numPr>
+        <w:rPr>
+          <w:lang w:eastAsia="pl-PL"/>
+        </w:rPr>
+      </w:pPr>
+      <w:r>
+        <w:rPr>
+          <w:lang w:eastAsia="pl-PL"/>
+        </w:rPr>
+        <w:t xml:space="preserve">łatwiejsza obsługa zwrotów i reklamacji części, </w:t>
+      </w:r>
+    </w:p>
+    <w:p>
+      <w:pPr>
+        <w:numPr>
+          <w:ilvl w:val="0"/>
+          <w:numId w:val="5"/>
+        </w:numPr>
+        <w:rPr>
+          <w:lang w:eastAsia="pl-PL"/>
+        </w:rPr>
+      </w:pPr>
+      <w:r>
+        <w:rPr>
+          <w:lang w:eastAsia="pl-PL"/>
+        </w:rPr>
+        <w:t xml:space="preserve">możliwość szybkiego udostępniania materiałów wideo subskrybentom, </w:t>
+      </w:r>
+    </w:p>
+    <w:p>
+      <w:pPr>
+        <w:numPr>
+          <w:ilvl w:val="0"/>
+          <w:numId w:val="5"/>
+        </w:numPr>
+        <w:rPr>
+          <w:lang w:eastAsia="pl-PL"/>
+        </w:rPr>
+      </w:pPr>
+      <w:r>
+        <w:rPr>
+          <w:lang w:eastAsia="pl-PL"/>
+        </w:rPr>
+        <w:t xml:space="preserve">łatwiejsze przygotowywanie raportów finansowych, </w:t>
+      </w:r>
+    </w:p>
+    <w:p>
+      <w:pPr>
+        <w:numPr>
+          <w:ilvl w:val="0"/>
+          <w:numId w:val="5"/>
+        </w:numPr>
+        <w:rPr>
+          <w:lang w:eastAsia="pl-PL"/>
+        </w:rPr>
+      </w:pPr>
+      <w:r>
+        <w:rPr>
+          <w:lang w:eastAsia="pl-PL"/>
+        </w:rPr>
+        <w:t>możliwość dalszej rozbudowy systemu o rankingi, powiadomienia, historię pojedynków i dodatkowe statystyki.</w:t>
+      </w:r>
+    </w:p>
+    <w:p>
+      <w:pPr>
+        <w:ind w:left="720"/>
+        <w:rPr>
+          <w:lang w:eastAsia="pl-PL"/>
+        </w:rPr>
+      </w:pPr>
+    </w:p>
+    <w:p>
+      <w:pPr>
+        <w:rPr>
+          <w:lang w:eastAsia="pl-PL"/>
+        </w:rPr>
+      </w:pPr>
+    </w:p>
+    <w:p/>
     <w:sectPr>
       <w:pgSz w:w="11906" w:h="16838"/>
       <w:pgMar w:top="1417" w:right="1417" w:bottom="1417" w:left="1417" w:header="708" w:footer="708" w:gutter="0"/>
@@ -303,6 +1054,304 @@
     </w:lvl>
   </w:abstractNum>
   <w:abstractNum w:abstractNumId="1" w15:restartNumberingAfterBreak="0">
+    <w:nsid w:val="0C3F7DDD"/>
+    <w:multiLevelType w:val="multilevel"/>
+    <w:tmpl w:val="B8620A46"/>
+    <w:lvl w:ilvl="0">
+      <w:start w:val="1"/>
+      <w:numFmt w:val="bullet"/>
+      <w:lvlText w:val=""/>
+      <w:lvlJc w:val="left"/>
+      <w:pPr>
+        <w:tabs>
+          <w:tab w:val="num" w:pos="720"/>
+        </w:tabs>
+        <w:ind w:left="720" w:hanging="360"/>
+      </w:pPr>
+      <w:rPr>
+        <w:rFonts w:ascii="Symbol" w:hAnsi="Symbol" w:hint="default"/>
+        <w:sz w:val="20"/>
+      </w:rPr>
+    </w:lvl>
+    <w:lvl w:ilvl="1" w:tentative="1">
+      <w:start w:val="1"/>
+      <w:numFmt w:val="bullet"/>
+      <w:lvlText w:val="o"/>
+      <w:lvlJc w:val="left"/>
+      <w:pPr>
+        <w:tabs>
+          <w:tab w:val="num" w:pos="1440"/>
+        </w:tabs>
+        <w:ind w:left="1440" w:hanging="360"/>
+      </w:pPr>
+      <w:rPr>
+        <w:rFonts w:ascii="Courier New" w:hAnsi="Courier New" w:hint="default"/>
+        <w:sz w:val="20"/>
+      </w:rPr>
+    </w:lvl>
+    <w:lvl w:ilvl="2" w:tentative="1">
+      <w:start w:val="1"/>
+      <w:numFmt w:val="bullet"/>
+      <w:lvlText w:val=""/>
+      <w:lvlJc w:val="left"/>
+      <w:pPr>
+        <w:tabs>
+          <w:tab w:val="num" w:pos="2160"/>
+        </w:tabs>
+        <w:ind w:left="2160" w:hanging="360"/>
+      </w:pPr>
+      <w:rPr>
+        <w:rFonts w:ascii="Wingdings" w:hAnsi="Wingdings" w:hint="default"/>
+        <w:sz w:val="20"/>
+      </w:rPr>
+    </w:lvl>
+    <w:lvl w:ilvl="3" w:tentative="1">
+      <w:start w:val="1"/>
+      <w:numFmt w:val="bullet"/>
+      <w:lvlText w:val=""/>
+      <w:lvlJc w:val="left"/>
+      <w:pPr>
+        <w:tabs>
+          <w:tab w:val="num" w:pos="2880"/>
+        </w:tabs>
+        <w:ind w:left="2880" w:hanging="360"/>
+      </w:pPr>
+      <w:rPr>
+        <w:rFonts w:ascii="Wingdings" w:hAnsi="Wingdings" w:hint="default"/>
+        <w:sz w:val="20"/>
+      </w:rPr>
+    </w:lvl>
+    <w:lvl w:ilvl="4" w:tentative="1">
+      <w:start w:val="1"/>
+      <w:numFmt w:val="bullet"/>
+      <w:lvlText w:val=""/>
+      <w:lvlJc w:val="left"/>
+      <w:pPr>
+        <w:tabs>
+          <w:tab w:val="num" w:pos="3600"/>
+        </w:tabs>
+        <w:ind w:left="3600" w:hanging="360"/>
+      </w:pPr>
+      <w:rPr>
+        <w:rFonts w:ascii="Wingdings" w:hAnsi="Wingdings" w:hint="default"/>
+        <w:sz w:val="20"/>
+      </w:rPr>
+    </w:lvl>
+    <w:lvl w:ilvl="5" w:tentative="1">
+      <w:start w:val="1"/>
+      <w:numFmt w:val="bullet"/>
+      <w:lvlText w:val=""/>
+      <w:lvlJc w:val="left"/>
+      <w:pPr>
+        <w:tabs>
+          <w:tab w:val="num" w:pos="4320"/>
+        </w:tabs>
+        <w:ind w:left="4320" w:hanging="360"/>
+      </w:pPr>
+      <w:rPr>
+        <w:rFonts w:ascii="Wingdings" w:hAnsi="Wingdings" w:hint="default"/>
+        <w:sz w:val="20"/>
+      </w:rPr>
+    </w:lvl>
+    <w:lvl w:ilvl="6" w:tentative="1">
+      <w:start w:val="1"/>
+      <w:numFmt w:val="bullet"/>
+      <w:lvlText w:val=""/>
+      <w:lvlJc w:val="left"/>
+      <w:pPr>
+        <w:tabs>
+          <w:tab w:val="num" w:pos="5040"/>
+        </w:tabs>
+        <w:ind w:left="5040" w:hanging="360"/>
+      </w:pPr>
+      <w:rPr>
+        <w:rFonts w:ascii="Wingdings" w:hAnsi="Wingdings" w:hint="default"/>
+        <w:sz w:val="20"/>
+      </w:rPr>
+    </w:lvl>
+    <w:lvl w:ilvl="7" w:tentative="1">
+      <w:start w:val="1"/>
+      <w:numFmt w:val="bullet"/>
+      <w:lvlText w:val=""/>
+      <w:lvlJc w:val="left"/>
+      <w:pPr>
+        <w:tabs>
+          <w:tab w:val="num" w:pos="5760"/>
+        </w:tabs>
+        <w:ind w:left="5760" w:hanging="360"/>
+      </w:pPr>
+      <w:rPr>
+        <w:rFonts w:ascii="Wingdings" w:hAnsi="Wingdings" w:hint="default"/>
+        <w:sz w:val="20"/>
+      </w:rPr>
+    </w:lvl>
+    <w:lvl w:ilvl="8" w:tentative="1">
+      <w:start w:val="1"/>
+      <w:numFmt w:val="bullet"/>
+      <w:lvlText w:val=""/>
+      <w:lvlJc w:val="left"/>
+      <w:pPr>
+        <w:tabs>
+          <w:tab w:val="num" w:pos="6480"/>
+        </w:tabs>
+        <w:ind w:left="6480" w:hanging="360"/>
+      </w:pPr>
+      <w:rPr>
+        <w:rFonts w:ascii="Wingdings" w:hAnsi="Wingdings" w:hint="default"/>
+        <w:sz w:val="20"/>
+      </w:rPr>
+    </w:lvl>
+  </w:abstractNum>
+  <w:abstractNum w:abstractNumId="2" w15:restartNumberingAfterBreak="0">
+    <w:nsid w:val="423778D5"/>
+    <w:multiLevelType w:val="multilevel"/>
+    <w:tmpl w:val="CB3442B8"/>
+    <w:lvl w:ilvl="0">
+      <w:start w:val="1"/>
+      <w:numFmt w:val="bullet"/>
+      <w:lvlText w:val=""/>
+      <w:lvlJc w:val="left"/>
+      <w:pPr>
+        <w:tabs>
+          <w:tab w:val="num" w:pos="720"/>
+        </w:tabs>
+        <w:ind w:left="720" w:hanging="360"/>
+      </w:pPr>
+      <w:rPr>
+        <w:rFonts w:ascii="Symbol" w:hAnsi="Symbol" w:hint="default"/>
+        <w:sz w:val="20"/>
+      </w:rPr>
+    </w:lvl>
+    <w:lvl w:ilvl="1" w:tentative="1">
+      <w:start w:val="1"/>
+      <w:numFmt w:val="bullet"/>
+      <w:lvlText w:val="o"/>
+      <w:lvlJc w:val="left"/>
+      <w:pPr>
+        <w:tabs>
+          <w:tab w:val="num" w:pos="1440"/>
+        </w:tabs>
+        <w:ind w:left="1440" w:hanging="360"/>
+      </w:pPr>
+      <w:rPr>
+        <w:rFonts w:ascii="Courier New" w:hAnsi="Courier New" w:hint="default"/>
+        <w:sz w:val="20"/>
+      </w:rPr>
+    </w:lvl>
+    <w:lvl w:ilvl="2" w:tentative="1">
+      <w:start w:val="1"/>
+      <w:numFmt w:val="bullet"/>
+      <w:lvlText w:val=""/>
+      <w:lvlJc w:val="left"/>
+      <w:pPr>
+        <w:tabs>
+          <w:tab w:val="num" w:pos="2160"/>
+        </w:tabs>
+        <w:ind w:left="2160" w:hanging="360"/>
+      </w:pPr>
+      <w:rPr>
+        <w:rFonts w:ascii="Wingdings" w:hAnsi="Wingdings" w:hint="default"/>
+        <w:sz w:val="20"/>
+      </w:rPr>
+    </w:lvl>
+    <w:lvl w:ilvl="3" w:tentative="1">
+      <w:start w:val="1"/>
+      <w:numFmt w:val="bullet"/>
+      <w:lvlText w:val=""/>
+      <w:lvlJc w:val="left"/>
+      <w:pPr>
+        <w:tabs>
+          <w:tab w:val="num" w:pos="2880"/>
+        </w:tabs>
+        <w:ind w:left="2880" w:hanging="360"/>
+      </w:pPr>
+      <w:rPr>
+        <w:rFonts w:ascii="Wingdings" w:hAnsi="Wingdings" w:hint="default"/>
+        <w:sz w:val="20"/>
+      </w:rPr>
+    </w:lvl>
+    <w:lvl w:ilvl="4" w:tentative="1">
+      <w:start w:val="1"/>
+      <w:numFmt w:val="bullet"/>
+      <w:lvlText w:val=""/>
+      <w:lvlJc w:val="left"/>
+      <w:pPr>
+        <w:tabs>
+          <w:tab w:val="num" w:pos="3600"/>
+        </w:tabs>
+        <w:ind w:left="3600" w:hanging="360"/>
+      </w:pPr>
+      <w:rPr>
+        <w:rFonts w:ascii="Wingdings" w:hAnsi="Wingdings" w:hint="default"/>
+        <w:sz w:val="20"/>
+      </w:rPr>
+    </w:lvl>
+    <w:lvl w:ilvl="5" w:tentative="1">
+      <w:start w:val="1"/>
+      <w:numFmt w:val="bullet"/>
+      <w:lvlText w:val=""/>
+      <w:lvlJc w:val="left"/>
+      <w:pPr>
+        <w:tabs>
+          <w:tab w:val="num" w:pos="4320"/>
+        </w:tabs>
+        <w:ind w:left="4320" w:hanging="360"/>
+      </w:pPr>
+      <w:rPr>
+        <w:rFonts w:ascii="Wingdings" w:hAnsi="Wingdings" w:hint="default"/>
+        <w:sz w:val="20"/>
+      </w:rPr>
+    </w:lvl>
+    <w:lvl w:ilvl="6" w:tentative="1">
+      <w:start w:val="1"/>
+      <w:numFmt w:val="bullet"/>
+      <w:lvlText w:val=""/>
+      <w:lvlJc w:val="left"/>
+      <w:pPr>
+        <w:tabs>
+          <w:tab w:val="num" w:pos="5040"/>
+        </w:tabs>
+        <w:ind w:left="5040" w:hanging="360"/>
+      </w:pPr>
+      <w:rPr>
+        <w:rFonts w:ascii="Wingdings" w:hAnsi="Wingdings" w:hint="default"/>
+        <w:sz w:val="20"/>
+      </w:rPr>
+    </w:lvl>
+    <w:lvl w:ilvl="7" w:tentative="1">
+      <w:start w:val="1"/>
+      <w:numFmt w:val="bullet"/>
+      <w:lvlText w:val=""/>
+      <w:lvlJc w:val="left"/>
+      <w:pPr>
+        <w:tabs>
+          <w:tab w:val="num" w:pos="5760"/>
+        </w:tabs>
+        <w:ind w:left="5760" w:hanging="360"/>
+      </w:pPr>
+      <w:rPr>
+        <w:rFonts w:ascii="Wingdings" w:hAnsi="Wingdings" w:hint="default"/>
+        <w:sz w:val="20"/>
+      </w:rPr>
+    </w:lvl>
+    <w:lvl w:ilvl="8" w:tentative="1">
+      <w:start w:val="1"/>
+      <w:numFmt w:val="bullet"/>
+      <w:lvlText w:val=""/>
+      <w:lvlJc w:val="left"/>
+      <w:pPr>
+        <w:tabs>
+          <w:tab w:val="num" w:pos="6480"/>
+        </w:tabs>
+        <w:ind w:left="6480" w:hanging="360"/>
+      </w:pPr>
+      <w:rPr>
+        <w:rFonts w:ascii="Wingdings" w:hAnsi="Wingdings" w:hint="default"/>
+        <w:sz w:val="20"/>
+      </w:rPr>
+    </w:lvl>
+  </w:abstractNum>
+  <w:abstractNum w:abstractNumId="3" w15:restartNumberingAfterBreak="0">
     <w:nsid w:val="5ADC7C5C"/>
     <w:multiLevelType w:val="hybridMultilevel"/>
     <w:tmpl w:val="7D7A5024"/>
@@ -389,13 +1438,171 @@
       <w:pPr>
         <w:ind w:left="6480" w:hanging="180"/>
       </w:pPr>
+    </w:lvl>
+  </w:abstractNum>
+  <w:abstractNum w:abstractNumId="4" w15:restartNumberingAfterBreak="0">
+    <w:nsid w:val="7EE43C4F"/>
+    <w:multiLevelType w:val="multilevel"/>
+    <w:tmpl w:val="C5247E00"/>
+    <w:lvl w:ilvl="0">
+      <w:start w:val="1"/>
+      <w:numFmt w:val="bullet"/>
+      <w:lvlText w:val=""/>
+      <w:lvlJc w:val="left"/>
+      <w:pPr>
+        <w:tabs>
+          <w:tab w:val="num" w:pos="720"/>
+        </w:tabs>
+        <w:ind w:left="720" w:hanging="360"/>
+      </w:pPr>
+      <w:rPr>
+        <w:rFonts w:ascii="Symbol" w:hAnsi="Symbol" w:hint="default"/>
+        <w:sz w:val="20"/>
+      </w:rPr>
+    </w:lvl>
+    <w:lvl w:ilvl="1" w:tentative="1">
+      <w:start w:val="1"/>
+      <w:numFmt w:val="bullet"/>
+      <w:lvlText w:val="o"/>
+      <w:lvlJc w:val="left"/>
+      <w:pPr>
+        <w:tabs>
+          <w:tab w:val="num" w:pos="1440"/>
+        </w:tabs>
+        <w:ind w:left="1440" w:hanging="360"/>
+      </w:pPr>
+      <w:rPr>
+        <w:rFonts w:ascii="Courier New" w:hAnsi="Courier New" w:hint="default"/>
+        <w:sz w:val="20"/>
+      </w:rPr>
+    </w:lvl>
+    <w:lvl w:ilvl="2" w:tentative="1">
+      <w:start w:val="1"/>
+      <w:numFmt w:val="bullet"/>
+      <w:lvlText w:val=""/>
+      <w:lvlJc w:val="left"/>
+      <w:pPr>
+        <w:tabs>
+          <w:tab w:val="num" w:pos="2160"/>
+        </w:tabs>
+        <w:ind w:left="2160" w:hanging="360"/>
+      </w:pPr>
+      <w:rPr>
+        <w:rFonts w:ascii="Wingdings" w:hAnsi="Wingdings" w:hint="default"/>
+        <w:sz w:val="20"/>
+      </w:rPr>
+    </w:lvl>
+    <w:lvl w:ilvl="3" w:tentative="1">
+      <w:start w:val="1"/>
+      <w:numFmt w:val="bullet"/>
+      <w:lvlText w:val=""/>
+      <w:lvlJc w:val="left"/>
+      <w:pPr>
+        <w:tabs>
+          <w:tab w:val="num" w:pos="2880"/>
+        </w:tabs>
+        <w:ind w:left="2880" w:hanging="360"/>
+      </w:pPr>
+      <w:rPr>
+        <w:rFonts w:ascii="Wingdings" w:hAnsi="Wingdings" w:hint="default"/>
+        <w:sz w:val="20"/>
+      </w:rPr>
+    </w:lvl>
+    <w:lvl w:ilvl="4" w:tentative="1">
+      <w:start w:val="1"/>
+      <w:numFmt w:val="bullet"/>
+      <w:lvlText w:val=""/>
+      <w:lvlJc w:val="left"/>
+      <w:pPr>
+        <w:tabs>
+          <w:tab w:val="num" w:pos="3600"/>
+        </w:tabs>
+        <w:ind w:left="3600" w:hanging="360"/>
+      </w:pPr>
+      <w:rPr>
+        <w:rFonts w:ascii="Wingdings" w:hAnsi="Wingdings" w:hint="default"/>
+        <w:sz w:val="20"/>
+      </w:rPr>
+    </w:lvl>
+    <w:lvl w:ilvl="5" w:tentative="1">
+      <w:start w:val="1"/>
+      <w:numFmt w:val="bullet"/>
+      <w:lvlText w:val=""/>
+      <w:lvlJc w:val="left"/>
+      <w:pPr>
+        <w:tabs>
+          <w:tab w:val="num" w:pos="4320"/>
+        </w:tabs>
+        <w:ind w:left="4320" w:hanging="360"/>
+      </w:pPr>
+      <w:rPr>
+        <w:rFonts w:ascii="Wingdings" w:hAnsi="Wingdings" w:hint="default"/>
+        <w:sz w:val="20"/>
+      </w:rPr>
+    </w:lvl>
+    <w:lvl w:ilvl="6" w:tentative="1">
+      <w:start w:val="1"/>
+      <w:numFmt w:val="bullet"/>
+      <w:lvlText w:val=""/>
+      <w:lvlJc w:val="left"/>
+      <w:pPr>
+        <w:tabs>
+          <w:tab w:val="num" w:pos="5040"/>
+        </w:tabs>
+        <w:ind w:left="5040" w:hanging="360"/>
+      </w:pPr>
+      <w:rPr>
+        <w:rFonts w:ascii="Wingdings" w:hAnsi="Wingdings" w:hint="default"/>
+        <w:sz w:val="20"/>
+      </w:rPr>
+    </w:lvl>
+    <w:lvl w:ilvl="7" w:tentative="1">
+      <w:start w:val="1"/>
+      <w:numFmt w:val="bullet"/>
+      <w:lvlText w:val=""/>
+      <w:lvlJc w:val="left"/>
+      <w:pPr>
+        <w:tabs>
+          <w:tab w:val="num" w:pos="5760"/>
+        </w:tabs>
+        <w:ind w:left="5760" w:hanging="360"/>
+      </w:pPr>
+      <w:rPr>
+        <w:rFonts w:ascii="Wingdings" w:hAnsi="Wingdings" w:hint="default"/>
+        <w:sz w:val="20"/>
+      </w:rPr>
+    </w:lvl>
+    <w:lvl w:ilvl="8" w:tentative="1">
+      <w:start w:val="1"/>
+      <w:numFmt w:val="bullet"/>
+      <w:lvlText w:val=""/>
+      <w:lvlJc w:val="left"/>
+      <w:pPr>
+        <w:tabs>
+          <w:tab w:val="num" w:pos="6480"/>
+        </w:tabs>
+        <w:ind w:left="6480" w:hanging="360"/>
+      </w:pPr>
+      <w:rPr>
+        <w:rFonts w:ascii="Wingdings" w:hAnsi="Wingdings" w:hint="default"/>
+        <w:sz w:val="20"/>
+      </w:rPr>
     </w:lvl>
   </w:abstractNum>
   <w:num w:numId="1" w16cid:durableId="1990861345">
     <w:abstractNumId w:val="0"/>
   </w:num>
   <w:num w:numId="2" w16cid:durableId="491020879">
+    <w:abstractNumId w:val="3"/>
+  </w:num>
+  <w:num w:numId="3" w16cid:durableId="1231847260">
     <w:abstractNumId w:val="1"/>
+  </w:num>
+  <w:num w:numId="4" w16cid:durableId="636836305">
+    <w:abstractNumId w:val="4"/>
+  </w:num>
+  <w:num w:numId="5" w16cid:durableId="1900704160">
+    <w:abstractNumId w:val="2"/>
   </w:num>
 </w:numbering>
 </file>
@@ -1351,6 +2558,25 @@
       <w:u w:val="single"/>
     </w:rPr>
   </w:style>
+  <w:style w:type="paragraph" w:styleId="NormalnyWeb">
+    <w:name w:val="Normal (Web)"/>
+    <w:basedOn w:val="Normalny"/>
+    <w:uiPriority w:val="99"/>
+    <w:semiHidden/>
+    <w:unhideWhenUsed/>
+    <w:rsid w:val="00CE6335"/>
+    <w:pPr>
+      <w:spacing w:before="100" w:beforeAutospacing="1" w:after="100" w:afterAutospacing="1" w:line="240" w:lineRule="auto"/>
+    </w:pPr>
+    <w:rPr>
+      <w:rFonts w:ascii="Times New Roman" w:eastAsia="Times New Roman" w:hAnsi="Times New Roman" w:cs="Times New Roman"/>
+      <w:kern w:val="0"/>
+      <w:sz w:val="24"/>
+      <w:szCs w:val="24"/>
+      <w:lang w:eastAsia="pl-PL"/>
+      <w14:ligatures w14:val="none"/>
+    </w:rPr>
+  </w:style>
 </w:styles>
 </file>
 

</xml_diff>